<commit_message>
Criação do login, e cadastro de usuário
</commit_message>
<xml_diff>
--- a/Desenvolvimento Projeto Integrador..docx
+++ b/Desenvolvimento Projeto Integrador..docx
@@ -252,6 +252,51 @@
             </w:r>
             <w:r>
               <w:t>sistema.</w:t>
+            </w:r>
+          </w:p>
+        </w:tc>
+      </w:tr>
+      <w:tr>
+        <w:trPr>
+          <w:cnfStyle w:val="000000100000" w:firstRow="0" w:lastRow="0" w:firstColumn="0" w:lastColumn="0" w:oddVBand="0" w:evenVBand="0" w:oddHBand="1" w:evenHBand="0" w:firstRowFirstColumn="0" w:firstRowLastColumn="0" w:lastRowFirstColumn="0" w:lastRowLastColumn="0"/>
+        </w:trPr>
+        <w:tc>
+          <w:tcPr>
+            <w:cnfStyle w:val="001000000000" w:firstRow="0" w:lastRow="0" w:firstColumn="1" w:lastColumn="0" w:oddVBand="0" w:evenVBand="0" w:oddHBand="0" w:evenHBand="0" w:firstRowFirstColumn="0" w:firstRowLastColumn="0" w:lastRowFirstColumn="0" w:lastRowLastColumn="0"/>
+            <w:tcW w:w="1560" w:type="dxa"/>
+          </w:tcPr>
+          <w:p>
+            <w:pPr>
+              <w:jc w:val="center"/>
+            </w:pPr>
+            <w:r>
+              <w:t>30/03/2025</w:t>
+            </w:r>
+          </w:p>
+        </w:tc>
+        <w:tc>
+          <w:tcPr>
+            <w:tcW w:w="3260" w:type="dxa"/>
+          </w:tcPr>
+          <w:p>
+            <w:pPr>
+              <w:cnfStyle w:val="000000100000" w:firstRow="0" w:lastRow="0" w:firstColumn="0" w:lastColumn="0" w:oddVBand="0" w:evenVBand="0" w:oddHBand="1" w:evenHBand="0" w:firstRowFirstColumn="0" w:firstRowLastColumn="0" w:lastRowFirstColumn="0" w:lastRowLastColumn="0"/>
+            </w:pPr>
+            <w:r>
+              <w:t>Finalização do login, acesso e autenticação do sistema, criação do cadastro de usuário.</w:t>
+            </w:r>
+          </w:p>
+        </w:tc>
+        <w:tc>
+          <w:tcPr>
+            <w:tcW w:w="3674" w:type="dxa"/>
+          </w:tcPr>
+          <w:p>
+            <w:pPr>
+              <w:cnfStyle w:val="000000100000" w:firstRow="0" w:lastRow="0" w:firstColumn="0" w:lastColumn="0" w:oddVBand="0" w:evenVBand="0" w:oddHBand="1" w:evenHBand="0" w:firstRowFirstColumn="0" w:firstRowLastColumn="0" w:lastRowFirstColumn="0" w:lastRowLastColumn="0"/>
+            </w:pPr>
+            <w:r>
+              <w:t>Iniciar o cadastro do cliente, e se der tempo, o cadastro de categoria e item.</w:t>
             </w:r>
           </w:p>
         </w:tc>

</xml_diff>

<commit_message>
iniciado o cadastro de cliente.
</commit_message>
<xml_diff>
--- a/Desenvolvimento Projeto Integrador..docx
+++ b/Desenvolvimento Projeto Integrador..docx
@@ -297,6 +297,48 @@
             </w:pPr>
             <w:r>
               <w:t>Iniciar o cadastro do cliente, e se der tempo, o cadastro de categoria e item.</w:t>
+            </w:r>
+          </w:p>
+        </w:tc>
+      </w:tr>
+      <w:tr>
+        <w:tc>
+          <w:tcPr>
+            <w:cnfStyle w:val="001000000000" w:firstRow="0" w:lastRow="0" w:firstColumn="1" w:lastColumn="0" w:oddVBand="0" w:evenVBand="0" w:oddHBand="0" w:evenHBand="0" w:firstRowFirstColumn="0" w:firstRowLastColumn="0" w:lastRowFirstColumn="0" w:lastRowLastColumn="0"/>
+            <w:tcW w:w="1560" w:type="dxa"/>
+          </w:tcPr>
+          <w:p>
+            <w:pPr>
+              <w:jc w:val="center"/>
+            </w:pPr>
+            <w:r>
+              <w:t>31/03/2025</w:t>
+            </w:r>
+          </w:p>
+        </w:tc>
+        <w:tc>
+          <w:tcPr>
+            <w:tcW w:w="3260" w:type="dxa"/>
+          </w:tcPr>
+          <w:p>
+            <w:pPr>
+              <w:cnfStyle w:val="000000000000" w:firstRow="0" w:lastRow="0" w:firstColumn="0" w:lastColumn="0" w:oddVBand="0" w:evenVBand="0" w:oddHBand="0" w:evenHBand="0" w:firstRowFirstColumn="0" w:firstRowLastColumn="0" w:lastRowFirstColumn="0" w:lastRowLastColumn="0"/>
+            </w:pPr>
+            <w:r>
+              <w:t>Finalizar o cadastro de cliente que apresenta erros</w:t>
+            </w:r>
+          </w:p>
+        </w:tc>
+        <w:tc>
+          <w:tcPr>
+            <w:tcW w:w="3674" w:type="dxa"/>
+          </w:tcPr>
+          <w:p>
+            <w:pPr>
+              <w:cnfStyle w:val="000000000000" w:firstRow="0" w:lastRow="0" w:firstColumn="0" w:lastColumn="0" w:oddVBand="0" w:evenVBand="0" w:oddHBand="0" w:evenHBand="0" w:firstRowFirstColumn="0" w:firstRowLastColumn="0" w:lastRowFirstColumn="0" w:lastRowLastColumn="0"/>
+            </w:pPr>
+            <w:r>
+              <w:t>Iniciar o cadastro de fornecedor.</w:t>
             </w:r>
           </w:p>
         </w:tc>

</xml_diff>